<commit_message>
first commit Full Project
</commit_message>
<xml_diff>
--- a/Rapport_MicrofinanceHub.docx
+++ b/Rapport_MicrofinanceHub.docx
@@ -2902,7 +2902,7 @@
         <w:rPr>
           <w:color w:val="064E3B"/>
         </w:rPr>
-        <w:t>5.5 Diagramme de Classes — Entites Principales</w:t>
+        <w:t>5.5 Diagramme de Classes Global</w:t>
       </w:r>
     </w:p>
     <w:p>
@@ -2914,14 +2914,14 @@
           <w:b w:val="0"/>
           <w:sz w:val="22"/>
         </w:rPr>
-        <w:t>Ce diagramme presente les entites metier principales et leurs relations. Chaque entite est geree par son microservice dedie et possede sa propre base de donnees PostgreSQL (pattern Database per Service).</w:t>
+        <w:t>Ce diagramme regroupe la totalite des entites metier de tous les microservices. Chaque zone coloree correspond a un service avec sa propre base de donnees PostgreSQL (pattern Database per Service). Les references cross-services utilisent des IDs simples (String/Long) plutot que des jointures JPA.</w:t>
       </w:r>
     </w:p>
     <w:p>
       <w:r>
         <w:drawing>
           <wp:inline xmlns:a="http://schemas.openxmlformats.org/drawingml/2006/main" xmlns:pic="http://schemas.openxmlformats.org/drawingml/2006/picture">
-            <wp:extent cx="5943600" cy="4408684"/>
+            <wp:extent cx="5943600" cy="4544114"/>
             <wp:docPr id="7" name="Picture 7"/>
             <wp:cNvGraphicFramePr>
               <a:graphicFrameLocks noChangeAspect="1"/>
@@ -2942,7 +2942,7 @@
                   <pic:spPr>
                     <a:xfrm>
                       <a:off x="0" y="0"/>
-                      <a:ext cx="5943600" cy="4408684"/>
+                      <a:ext cx="5943600" cy="4544114"/>
                     </a:xfrm>
                     <a:prstGeom prst="rect"/>
                   </pic:spPr>
@@ -2963,7 +2963,7 @@
           <w:color w:val="444444"/>
           <w:sz w:val="18"/>
         </w:rPr>
-        <w:t>Figure 7 — Diagramme de Classes Principales</w:t>
+        <w:t>Figure 7 — Diagramme de Classes Global (10 microservices)</w:t>
       </w:r>
     </w:p>
     <w:p/>
@@ -2981,7 +2981,7 @@
         <w:rPr>
           <w:color w:val="064E3B"/>
         </w:rPr>
-        <w:t>5.6 Architecture par Couche — Service Typique</w:t>
+        <w:t>5.6 Diagrammes de Classes par Service</w:t>
       </w:r>
     </w:p>
     <w:p>
@@ -2993,14 +2993,26 @@
           <w:b w:val="0"/>
           <w:sz w:val="22"/>
         </w:rPr>
-        <w:t>Ce diagramme illustre l'organisation interne de chaque microservice selon le pattern en couches : Controller (presentation), Service (logique metier), Repository (persistance JPA) et Entity/DTO (domaine). Les composants transverses (SecurityConfig, FeignClient, GlobalExceptionHandler) sont communs a tous les services.</w:t>
+        <w:t>Les diagrammes suivants detaillent les entites (avec tous les attributs) et les enumerations de chaque microservice.</w:t>
+      </w:r>
+    </w:p>
+    <w:p>
+      <w:pPr>
+        <w:pStyle w:val="Heading3"/>
+        <w:spacing w:before="240" w:after="120"/>
+      </w:pPr>
+      <w:r>
+        <w:rPr>
+          <w:color w:val="064E3B"/>
+        </w:rPr>
+        <w:t>5.6.1 auth-service (:8080)</w:t>
       </w:r>
     </w:p>
     <w:p>
       <w:r>
         <w:drawing>
           <wp:inline xmlns:a="http://schemas.openxmlformats.org/drawingml/2006/main" xmlns:pic="http://schemas.openxmlformats.org/drawingml/2006/picture">
-            <wp:extent cx="5943600" cy="3741878"/>
+            <wp:extent cx="5943600" cy="4404069"/>
             <wp:docPr id="8" name="Picture 8"/>
             <wp:cNvGraphicFramePr>
               <a:graphicFrameLocks noChangeAspect="1"/>
@@ -3021,7 +3033,7 @@
                   <pic:spPr>
                     <a:xfrm>
                       <a:off x="0" y="0"/>
-                      <a:ext cx="5943600" cy="3741878"/>
+                      <a:ext cx="5943600" cy="4404069"/>
                     </a:xfrm>
                     <a:prstGeom prst="rect"/>
                   </pic:spPr>
@@ -3042,7 +3054,7 @@
           <w:color w:val="444444"/>
           <w:sz w:val="18"/>
         </w:rPr>
-        <w:t>Figure 8 — Architecture en Couches (service typique)</w:t>
+        <w:t>Figure 8a — auth-service : User, Role, Privilege, RefreshToken, UserSession, AuditLog, PasswordResetToken</w:t>
       </w:r>
     </w:p>
     <w:p/>
@@ -3053,33 +3065,21 @@
     </w:p>
     <w:p>
       <w:pPr>
-        <w:pStyle w:val="Heading2"/>
+        <w:pStyle w:val="Heading3"/>
         <w:spacing w:before="240" w:after="120"/>
       </w:pPr>
       <w:r>
         <w:rPr>
           <w:color w:val="064E3B"/>
         </w:rPr>
-        <w:t>5.7 Diagramme d'Etats — Compte Bancaire</w:t>
-      </w:r>
-    </w:p>
-    <w:p>
-      <w:pPr>
-        <w:spacing w:after="120"/>
-      </w:pPr>
-      <w:r>
-        <w:rPr>
-          <w:b w:val="0"/>
-          <w:sz w:val="22"/>
-        </w:rPr>
-        <w:t>Un compte bancaire suit un cycle de vie strict : cree en EN_ATTENTE_VALIDATION, il doit etre approuve par un directeur ou admin (-&gt; ACTIF). Il peut ensuite etre bloque, debloque ou ferme. Un rejet lors de la validation le place en etat REJETE.</w:t>
+        <w:t>5.6.2 client-service (:8081)</w:t>
       </w:r>
     </w:p>
     <w:p>
       <w:r>
         <w:drawing>
           <wp:inline xmlns:a="http://schemas.openxmlformats.org/drawingml/2006/main" xmlns:pic="http://schemas.openxmlformats.org/drawingml/2006/picture">
-            <wp:extent cx="5669280" cy="3400884"/>
+            <wp:extent cx="5943600" cy="4394031"/>
             <wp:docPr id="9" name="Picture 9"/>
             <wp:cNvGraphicFramePr>
               <a:graphicFrameLocks noChangeAspect="1"/>
@@ -3100,7 +3100,7 @@
                   <pic:spPr>
                     <a:xfrm>
                       <a:off x="0" y="0"/>
-                      <a:ext cx="5669280" cy="3400884"/>
+                      <a:ext cx="5943600" cy="4394031"/>
                     </a:xfrm>
                     <a:prstGeom prst="rect"/>
                   </pic:spPr>
@@ -3121,39 +3121,32 @@
           <w:color w:val="444444"/>
           <w:sz w:val="18"/>
         </w:rPr>
-        <w:t>Figure 9 — Diagramme d'Etats : Compte Bancaire (StatutCompte)</w:t>
+        <w:t>Figure 8b — client-service : Client, Document</w:t>
       </w:r>
     </w:p>
     <w:p/>
     <w:p>
-      <w:pPr>
-        <w:pStyle w:val="Heading2"/>
+      <w:r>
+        <w:br w:type="page"/>
+      </w:r>
+    </w:p>
+    <w:p>
+      <w:pPr>
+        <w:pStyle w:val="Heading3"/>
         <w:spacing w:before="240" w:after="120"/>
       </w:pPr>
       <w:r>
         <w:rPr>
           <w:color w:val="064E3B"/>
         </w:rPr>
-        <w:t>5.8 Diagramme d'Etats — Pret</w:t>
-      </w:r>
-    </w:p>
-    <w:p>
-      <w:pPr>
-        <w:spacing w:after="120"/>
-      </w:pPr>
-      <w:r>
-        <w:rPr>
-          <w:b w:val="0"/>
-          <w:sz w:val="22"/>
-        </w:rPr>
-        <w:t>Le cycle de vie d'un pret commence a l'etat PENDING apres soumission de la demande. Un admin ou directeur peut l'approuver (-&gt; APPROVED) ou le rejeter (-&gt; REJECTED). Apres decaissement, il passe ACTIVE, puis COMPLETED a remboursement total ou DEFAULTED en cas de defaut de paiement.</w:t>
+        <w:t>5.6.3 account-service (:8082)</w:t>
       </w:r>
     </w:p>
     <w:p>
       <w:r>
         <w:drawing>
           <wp:inline xmlns:a="http://schemas.openxmlformats.org/drawingml/2006/main" xmlns:pic="http://schemas.openxmlformats.org/drawingml/2006/picture">
-            <wp:extent cx="5669280" cy="3400884"/>
+            <wp:extent cx="5943600" cy="5109410"/>
             <wp:docPr id="10" name="Picture 10"/>
             <wp:cNvGraphicFramePr>
               <a:graphicFrameLocks noChangeAspect="1"/>
@@ -3174,7 +3167,7 @@
                   <pic:spPr>
                     <a:xfrm>
                       <a:off x="0" y="0"/>
-                      <a:ext cx="5669280" cy="3400884"/>
+                      <a:ext cx="5943600" cy="5109410"/>
                     </a:xfrm>
                     <a:prstGeom prst="rect"/>
                   </pic:spPr>
@@ -3195,7 +3188,7 @@
           <w:color w:val="444444"/>
           <w:sz w:val="18"/>
         </w:rPr>
-        <w:t>Figure 10 — Diagramme d'Etats : Pret (LoanStatus)</w:t>
+        <w:t>Figure 8c — account-service : Compte</w:t>
       </w:r>
     </w:p>
     <w:p/>
@@ -3206,33 +3199,21 @@
     </w:p>
     <w:p>
       <w:pPr>
-        <w:pStyle w:val="Heading2"/>
+        <w:pStyle w:val="Heading3"/>
         <w:spacing w:before="240" w:after="120"/>
       </w:pPr>
       <w:r>
         <w:rPr>
           <w:color w:val="064E3B"/>
         </w:rPr>
-        <w:t>5.9 Diagramme d'Etats — Paiement/Remboursement</w:t>
-      </w:r>
-    </w:p>
-    <w:p>
-      <w:pPr>
-        <w:spacing w:after="120"/>
-      </w:pPr>
-      <w:r>
-        <w:rPr>
-          <w:b w:val="0"/>
-          <w:sz w:val="22"/>
-        </w:rPr>
-        <w:t>Un paiement enregistre par un agent ou directeur passe en PENDING_VALIDATION et attend la validation de l'admin. Un paiement direct client ou un webhook CamPay peuvent passer directement en COMPLETED. En cas de probleme, le statut passe en FAILED.</w:t>
+        <w:t>5.6.4 agency-service (:8086)</w:t>
       </w:r>
     </w:p>
     <w:p>
       <w:r>
         <w:drawing>
           <wp:inline xmlns:a="http://schemas.openxmlformats.org/drawingml/2006/main" xmlns:pic="http://schemas.openxmlformats.org/drawingml/2006/picture">
-            <wp:extent cx="5669280" cy="3400884"/>
+            <wp:extent cx="5943600" cy="3852333"/>
             <wp:docPr id="11" name="Picture 11"/>
             <wp:cNvGraphicFramePr>
               <a:graphicFrameLocks noChangeAspect="1"/>
@@ -3253,6 +3234,645 @@
                   <pic:spPr>
                     <a:xfrm>
                       <a:off x="0" y="0"/>
+                      <a:ext cx="5943600" cy="3852333"/>
+                    </a:xfrm>
+                    <a:prstGeom prst="rect"/>
+                  </pic:spPr>
+                </pic:pic>
+              </a:graphicData>
+            </a:graphic>
+          </wp:inline>
+        </w:drawing>
+      </w:r>
+    </w:p>
+    <w:p>
+      <w:pPr>
+        <w:jc w:val="center"/>
+      </w:pPr>
+      <w:r>
+        <w:rPr>
+          <w:i/>
+          <w:color w:val="444444"/>
+          <w:sz w:val="18"/>
+        </w:rPr>
+        <w:t>Figure 8d — agency-service : Agency, AgentAssignment, AgencyStats, AgencyConfiguration</w:t>
+      </w:r>
+    </w:p>
+    <w:p/>
+    <w:p>
+      <w:r>
+        <w:br w:type="page"/>
+      </w:r>
+    </w:p>
+    <w:p>
+      <w:pPr>
+        <w:pStyle w:val="Heading3"/>
+        <w:spacing w:before="240" w:after="120"/>
+      </w:pPr>
+      <w:r>
+        <w:rPr>
+          <w:color w:val="064E3B"/>
+        </w:rPr>
+        <w:t>5.6.5 loan-service (:8083)</w:t>
+      </w:r>
+    </w:p>
+    <w:p>
+      <w:r>
+        <w:drawing>
+          <wp:inline xmlns:a="http://schemas.openxmlformats.org/drawingml/2006/main" xmlns:pic="http://schemas.openxmlformats.org/drawingml/2006/picture">
+            <wp:extent cx="5943600" cy="3875861"/>
+            <wp:docPr id="12" name="Picture 12"/>
+            <wp:cNvGraphicFramePr>
+              <a:graphicFrameLocks noChangeAspect="1"/>
+            </wp:cNvGraphicFramePr>
+            <a:graphic>
+              <a:graphicData uri="http://schemas.openxmlformats.org/drawingml/2006/picture">
+                <pic:pic>
+                  <pic:nvPicPr>
+                    <pic:cNvPr id="0" name="image.png"/>
+                    <pic:cNvPicPr/>
+                  </pic:nvPicPr>
+                  <pic:blipFill>
+                    <a:blip r:embed="rId20"/>
+                    <a:stretch>
+                      <a:fillRect/>
+                    </a:stretch>
+                  </pic:blipFill>
+                  <pic:spPr>
+                    <a:xfrm>
+                      <a:off x="0" y="0"/>
+                      <a:ext cx="5943600" cy="3875861"/>
+                    </a:xfrm>
+                    <a:prstGeom prst="rect"/>
+                  </pic:spPr>
+                </pic:pic>
+              </a:graphicData>
+            </a:graphic>
+          </wp:inline>
+        </w:drawing>
+      </w:r>
+    </w:p>
+    <w:p>
+      <w:pPr>
+        <w:jc w:val="center"/>
+      </w:pPr>
+      <w:r>
+        <w:rPr>
+          <w:i/>
+          <w:color w:val="444444"/>
+          <w:sz w:val="18"/>
+        </w:rPr>
+        <w:t>Figure 8e — loan-service : LoanProduct, LoanApplication, Loan, AmortizationSchedule, Schedule</w:t>
+      </w:r>
+    </w:p>
+    <w:p/>
+    <w:p>
+      <w:r>
+        <w:br w:type="page"/>
+      </w:r>
+    </w:p>
+    <w:p>
+      <w:pPr>
+        <w:pStyle w:val="Heading3"/>
+        <w:spacing w:before="240" w:after="120"/>
+      </w:pPr>
+      <w:r>
+        <w:rPr>
+          <w:color w:val="064E3B"/>
+        </w:rPr>
+        <w:t>5.6.6 repayment-service (:8084)</w:t>
+      </w:r>
+    </w:p>
+    <w:p>
+      <w:r>
+        <w:drawing>
+          <wp:inline xmlns:a="http://schemas.openxmlformats.org/drawingml/2006/main" xmlns:pic="http://schemas.openxmlformats.org/drawingml/2006/picture">
+            <wp:extent cx="5943600" cy="4078172"/>
+            <wp:docPr id="13" name="Picture 13"/>
+            <wp:cNvGraphicFramePr>
+              <a:graphicFrameLocks noChangeAspect="1"/>
+            </wp:cNvGraphicFramePr>
+            <a:graphic>
+              <a:graphicData uri="http://schemas.openxmlformats.org/drawingml/2006/picture">
+                <pic:pic>
+                  <pic:nvPicPr>
+                    <pic:cNvPr id="0" name="image.png"/>
+                    <pic:cNvPicPr/>
+                  </pic:nvPicPr>
+                  <pic:blipFill>
+                    <a:blip r:embed="rId21"/>
+                    <a:stretch>
+                      <a:fillRect/>
+                    </a:stretch>
+                  </pic:blipFill>
+                  <pic:spPr>
+                    <a:xfrm>
+                      <a:off x="0" y="0"/>
+                      <a:ext cx="5943600" cy="4078172"/>
+                    </a:xfrm>
+                    <a:prstGeom prst="rect"/>
+                  </pic:spPr>
+                </pic:pic>
+              </a:graphicData>
+            </a:graphic>
+          </wp:inline>
+        </w:drawing>
+      </w:r>
+    </w:p>
+    <w:p>
+      <w:pPr>
+        <w:jc w:val="center"/>
+      </w:pPr>
+      <w:r>
+        <w:rPr>
+          <w:i/>
+          <w:color w:val="444444"/>
+          <w:sz w:val="18"/>
+        </w:rPr>
+        <w:t>Figure 8f — repayment-service : Repayment, Payment, Schedule, Penalty</w:t>
+      </w:r>
+    </w:p>
+    <w:p/>
+    <w:p>
+      <w:r>
+        <w:br w:type="page"/>
+      </w:r>
+    </w:p>
+    <w:p>
+      <w:pPr>
+        <w:pStyle w:val="Heading3"/>
+        <w:spacing w:before="240" w:after="120"/>
+      </w:pPr>
+      <w:r>
+        <w:rPr>
+          <w:color w:val="064E3B"/>
+        </w:rPr>
+        <w:t>5.6.7 transaction-service (:8088)</w:t>
+      </w:r>
+    </w:p>
+    <w:p>
+      <w:r>
+        <w:drawing>
+          <wp:inline xmlns:a="http://schemas.openxmlformats.org/drawingml/2006/main" xmlns:pic="http://schemas.openxmlformats.org/drawingml/2006/picture">
+            <wp:extent cx="5943600" cy="4394031"/>
+            <wp:docPr id="14" name="Picture 14"/>
+            <wp:cNvGraphicFramePr>
+              <a:graphicFrameLocks noChangeAspect="1"/>
+            </wp:cNvGraphicFramePr>
+            <a:graphic>
+              <a:graphicData uri="http://schemas.openxmlformats.org/drawingml/2006/picture">
+                <pic:pic>
+                  <pic:nvPicPr>
+                    <pic:cNvPr id="0" name="image.png"/>
+                    <pic:cNvPicPr/>
+                  </pic:nvPicPr>
+                  <pic:blipFill>
+                    <a:blip r:embed="rId22"/>
+                    <a:stretch>
+                      <a:fillRect/>
+                    </a:stretch>
+                  </pic:blipFill>
+                  <pic:spPr>
+                    <a:xfrm>
+                      <a:off x="0" y="0"/>
+                      <a:ext cx="5943600" cy="4394031"/>
+                    </a:xfrm>
+                    <a:prstGeom prst="rect"/>
+                  </pic:spPr>
+                </pic:pic>
+              </a:graphicData>
+            </a:graphic>
+          </wp:inline>
+        </w:drawing>
+      </w:r>
+    </w:p>
+    <w:p>
+      <w:pPr>
+        <w:jc w:val="center"/>
+      </w:pPr>
+      <w:r>
+        <w:rPr>
+          <w:i/>
+          <w:color w:val="444444"/>
+          <w:sz w:val="18"/>
+        </w:rPr>
+        <w:t>Figure 8g — transaction-service : Transaction</w:t>
+      </w:r>
+    </w:p>
+    <w:p/>
+    <w:p>
+      <w:r>
+        <w:br w:type="page"/>
+      </w:r>
+    </w:p>
+    <w:p>
+      <w:pPr>
+        <w:pStyle w:val="Heading3"/>
+        <w:spacing w:before="240" w:after="120"/>
+      </w:pPr>
+      <w:r>
+        <w:rPr>
+          <w:color w:val="064E3B"/>
+        </w:rPr>
+        <w:t>5.6.8 notification-service (:8089)</w:t>
+      </w:r>
+    </w:p>
+    <w:p>
+      <w:r>
+        <w:drawing>
+          <wp:inline xmlns:a="http://schemas.openxmlformats.org/drawingml/2006/main" xmlns:pic="http://schemas.openxmlformats.org/drawingml/2006/picture">
+            <wp:extent cx="5943600" cy="4578773"/>
+            <wp:docPr id="15" name="Picture 15"/>
+            <wp:cNvGraphicFramePr>
+              <a:graphicFrameLocks noChangeAspect="1"/>
+            </wp:cNvGraphicFramePr>
+            <a:graphic>
+              <a:graphicData uri="http://schemas.openxmlformats.org/drawingml/2006/picture">
+                <pic:pic>
+                  <pic:nvPicPr>
+                    <pic:cNvPr id="0" name="image.png"/>
+                    <pic:cNvPicPr/>
+                  </pic:nvPicPr>
+                  <pic:blipFill>
+                    <a:blip r:embed="rId23"/>
+                    <a:stretch>
+                      <a:fillRect/>
+                    </a:stretch>
+                  </pic:blipFill>
+                  <pic:spPr>
+                    <a:xfrm>
+                      <a:off x="0" y="0"/>
+                      <a:ext cx="5943600" cy="4578773"/>
+                    </a:xfrm>
+                    <a:prstGeom prst="rect"/>
+                  </pic:spPr>
+                </pic:pic>
+              </a:graphicData>
+            </a:graphic>
+          </wp:inline>
+        </w:drawing>
+      </w:r>
+    </w:p>
+    <w:p>
+      <w:pPr>
+        <w:jc w:val="center"/>
+      </w:pPr>
+      <w:r>
+        <w:rPr>
+          <w:i/>
+          <w:color w:val="444444"/>
+          <w:sz w:val="18"/>
+        </w:rPr>
+        <w:t>Figure 8h — notification-service : Notification, NotificationTemplate</w:t>
+      </w:r>
+    </w:p>
+    <w:p/>
+    <w:p>
+      <w:r>
+        <w:br w:type="page"/>
+      </w:r>
+    </w:p>
+    <w:p>
+      <w:pPr>
+        <w:pStyle w:val="Heading3"/>
+        <w:spacing w:before="240" w:after="120"/>
+      </w:pPr>
+      <w:r>
+        <w:rPr>
+          <w:color w:val="064E3B"/>
+        </w:rPr>
+        <w:t>5.6.9 reporting-service (:8085)</w:t>
+      </w:r>
+    </w:p>
+    <w:p>
+      <w:r>
+        <w:drawing>
+          <wp:inline xmlns:a="http://schemas.openxmlformats.org/drawingml/2006/main" xmlns:pic="http://schemas.openxmlformats.org/drawingml/2006/picture">
+            <wp:extent cx="5943600" cy="4394031"/>
+            <wp:docPr id="16" name="Picture 16"/>
+            <wp:cNvGraphicFramePr>
+              <a:graphicFrameLocks noChangeAspect="1"/>
+            </wp:cNvGraphicFramePr>
+            <a:graphic>
+              <a:graphicData uri="http://schemas.openxmlformats.org/drawingml/2006/picture">
+                <pic:pic>
+                  <pic:nvPicPr>
+                    <pic:cNvPr id="0" name="image.png"/>
+                    <pic:cNvPicPr/>
+                  </pic:nvPicPr>
+                  <pic:blipFill>
+                    <a:blip r:embed="rId24"/>
+                    <a:stretch>
+                      <a:fillRect/>
+                    </a:stretch>
+                  </pic:blipFill>
+                  <pic:spPr>
+                    <a:xfrm>
+                      <a:off x="0" y="0"/>
+                      <a:ext cx="5943600" cy="4394031"/>
+                    </a:xfrm>
+                    <a:prstGeom prst="rect"/>
+                  </pic:spPr>
+                </pic:pic>
+              </a:graphicData>
+            </a:graphic>
+          </wp:inline>
+        </w:drawing>
+      </w:r>
+    </w:p>
+    <w:p>
+      <w:pPr>
+        <w:jc w:val="center"/>
+      </w:pPr>
+      <w:r>
+        <w:rPr>
+          <w:i/>
+          <w:color w:val="444444"/>
+          <w:sz w:val="18"/>
+        </w:rPr>
+        <w:t>Figure 8i — reporting-service : Report, Kpi</w:t>
+      </w:r>
+    </w:p>
+    <w:p/>
+    <w:p>
+      <w:r>
+        <w:br w:type="page"/>
+      </w:r>
+    </w:p>
+    <w:p>
+      <w:pPr>
+        <w:pStyle w:val="Heading3"/>
+        <w:spacing w:before="240" w:after="120"/>
+      </w:pPr>
+      <w:r>
+        <w:rPr>
+          <w:color w:val="064E3B"/>
+        </w:rPr>
+        <w:t>5.6.10 configuration-service (:8087)</w:t>
+      </w:r>
+    </w:p>
+    <w:p>
+      <w:r>
+        <w:drawing>
+          <wp:inline xmlns:a="http://schemas.openxmlformats.org/drawingml/2006/main" xmlns:pic="http://schemas.openxmlformats.org/drawingml/2006/picture">
+            <wp:extent cx="5943600" cy="4723432"/>
+            <wp:docPr id="17" name="Picture 17"/>
+            <wp:cNvGraphicFramePr>
+              <a:graphicFrameLocks noChangeAspect="1"/>
+            </wp:cNvGraphicFramePr>
+            <a:graphic>
+              <a:graphicData uri="http://schemas.openxmlformats.org/drawingml/2006/picture">
+                <pic:pic>
+                  <pic:nvPicPr>
+                    <pic:cNvPr id="0" name="image.png"/>
+                    <pic:cNvPicPr/>
+                  </pic:nvPicPr>
+                  <pic:blipFill>
+                    <a:blip r:embed="rId25"/>
+                    <a:stretch>
+                      <a:fillRect/>
+                    </a:stretch>
+                  </pic:blipFill>
+                  <pic:spPr>
+                    <a:xfrm>
+                      <a:off x="0" y="0"/>
+                      <a:ext cx="5943600" cy="4723432"/>
+                    </a:xfrm>
+                    <a:prstGeom prst="rect"/>
+                  </pic:spPr>
+                </pic:pic>
+              </a:graphicData>
+            </a:graphic>
+          </wp:inline>
+        </w:drawing>
+      </w:r>
+    </w:p>
+    <w:p>
+      <w:pPr>
+        <w:jc w:val="center"/>
+      </w:pPr>
+      <w:r>
+        <w:rPr>
+          <w:i/>
+          <w:color w:val="444444"/>
+          <w:sz w:val="18"/>
+        </w:rPr>
+        <w:t>Figure 8j — configuration-service : MicrofinanceConfiguration, AccountCategory, AccountTypeConfiguration</w:t>
+      </w:r>
+    </w:p>
+    <w:p/>
+    <w:p>
+      <w:r>
+        <w:br w:type="page"/>
+      </w:r>
+    </w:p>
+    <w:p>
+      <w:r>
+        <w:br w:type="page"/>
+      </w:r>
+    </w:p>
+    <w:p>
+      <w:pPr>
+        <w:pStyle w:val="Heading2"/>
+        <w:spacing w:before="240" w:after="120"/>
+      </w:pPr>
+      <w:r>
+        <w:rPr>
+          <w:color w:val="064E3B"/>
+        </w:rPr>
+        <w:t>5.7 Diagramme d'Etats — Compte Bancaire</w:t>
+      </w:r>
+    </w:p>
+    <w:p>
+      <w:pPr>
+        <w:spacing w:after="120"/>
+      </w:pPr>
+      <w:r>
+        <w:rPr>
+          <w:b w:val="0"/>
+          <w:sz w:val="22"/>
+        </w:rPr>
+        <w:t>Un compte bancaire suit un cycle de vie strict : cree en EN_ATTENTE_VALIDATION, il doit etre approuve par un directeur ou admin (-&gt; ACTIF). Il peut ensuite etre bloque, debloque ou ferme. Un rejet lors de la validation le place en etat REJETE.</w:t>
+      </w:r>
+    </w:p>
+    <w:p>
+      <w:r>
+        <w:drawing>
+          <wp:inline xmlns:a="http://schemas.openxmlformats.org/drawingml/2006/main" xmlns:pic="http://schemas.openxmlformats.org/drawingml/2006/picture">
+            <wp:extent cx="5669280" cy="3400884"/>
+            <wp:docPr id="18" name="Picture 18"/>
+            <wp:cNvGraphicFramePr>
+              <a:graphicFrameLocks noChangeAspect="1"/>
+            </wp:cNvGraphicFramePr>
+            <a:graphic>
+              <a:graphicData uri="http://schemas.openxmlformats.org/drawingml/2006/picture">
+                <pic:pic>
+                  <pic:nvPicPr>
+                    <pic:cNvPr id="0" name="image.png"/>
+                    <pic:cNvPicPr/>
+                  </pic:nvPicPr>
+                  <pic:blipFill>
+                    <a:blip r:embed="rId26"/>
+                    <a:stretch>
+                      <a:fillRect/>
+                    </a:stretch>
+                  </pic:blipFill>
+                  <pic:spPr>
+                    <a:xfrm>
+                      <a:off x="0" y="0"/>
+                      <a:ext cx="5669280" cy="3400884"/>
+                    </a:xfrm>
+                    <a:prstGeom prst="rect"/>
+                  </pic:spPr>
+                </pic:pic>
+              </a:graphicData>
+            </a:graphic>
+          </wp:inline>
+        </w:drawing>
+      </w:r>
+    </w:p>
+    <w:p>
+      <w:pPr>
+        <w:jc w:val="center"/>
+      </w:pPr>
+      <w:r>
+        <w:rPr>
+          <w:i/>
+          <w:color w:val="444444"/>
+          <w:sz w:val="18"/>
+        </w:rPr>
+        <w:t>Figure 9 — Diagramme d'Etats : Compte Bancaire (StatutCompte)</w:t>
+      </w:r>
+    </w:p>
+    <w:p/>
+    <w:p>
+      <w:pPr>
+        <w:pStyle w:val="Heading2"/>
+        <w:spacing w:before="240" w:after="120"/>
+      </w:pPr>
+      <w:r>
+        <w:rPr>
+          <w:color w:val="064E3B"/>
+        </w:rPr>
+        <w:t>5.8 Diagramme d'Etats — Pret</w:t>
+      </w:r>
+    </w:p>
+    <w:p>
+      <w:pPr>
+        <w:spacing w:after="120"/>
+      </w:pPr>
+      <w:r>
+        <w:rPr>
+          <w:b w:val="0"/>
+          <w:sz w:val="22"/>
+        </w:rPr>
+        <w:t>Le cycle de vie d'un pret commence a l'etat PENDING apres soumission de la demande. Un admin ou directeur peut l'approuver (-&gt; APPROVED) ou le rejeter (-&gt; REJECTED). Apres decaissement, il passe ACTIVE, puis COMPLETED a remboursement total ou DEFAULTED en cas de defaut de paiement.</w:t>
+      </w:r>
+    </w:p>
+    <w:p>
+      <w:r>
+        <w:drawing>
+          <wp:inline xmlns:a="http://schemas.openxmlformats.org/drawingml/2006/main" xmlns:pic="http://schemas.openxmlformats.org/drawingml/2006/picture">
+            <wp:extent cx="5669280" cy="3400884"/>
+            <wp:docPr id="19" name="Picture 19"/>
+            <wp:cNvGraphicFramePr>
+              <a:graphicFrameLocks noChangeAspect="1"/>
+            </wp:cNvGraphicFramePr>
+            <a:graphic>
+              <a:graphicData uri="http://schemas.openxmlformats.org/drawingml/2006/picture">
+                <pic:pic>
+                  <pic:nvPicPr>
+                    <pic:cNvPr id="0" name="image.png"/>
+                    <pic:cNvPicPr/>
+                  </pic:nvPicPr>
+                  <pic:blipFill>
+                    <a:blip r:embed="rId27"/>
+                    <a:stretch>
+                      <a:fillRect/>
+                    </a:stretch>
+                  </pic:blipFill>
+                  <pic:spPr>
+                    <a:xfrm>
+                      <a:off x="0" y="0"/>
+                      <a:ext cx="5669280" cy="3400884"/>
+                    </a:xfrm>
+                    <a:prstGeom prst="rect"/>
+                  </pic:spPr>
+                </pic:pic>
+              </a:graphicData>
+            </a:graphic>
+          </wp:inline>
+        </w:drawing>
+      </w:r>
+    </w:p>
+    <w:p>
+      <w:pPr>
+        <w:jc w:val="center"/>
+      </w:pPr>
+      <w:r>
+        <w:rPr>
+          <w:i/>
+          <w:color w:val="444444"/>
+          <w:sz w:val="18"/>
+        </w:rPr>
+        <w:t>Figure 10 — Diagramme d'Etats : Pret (LoanStatus)</w:t>
+      </w:r>
+    </w:p>
+    <w:p/>
+    <w:p>
+      <w:r>
+        <w:br w:type="page"/>
+      </w:r>
+    </w:p>
+    <w:p>
+      <w:pPr>
+        <w:pStyle w:val="Heading2"/>
+        <w:spacing w:before="240" w:after="120"/>
+      </w:pPr>
+      <w:r>
+        <w:rPr>
+          <w:color w:val="064E3B"/>
+        </w:rPr>
+        <w:t>5.9 Diagramme d'Etats — Paiement/Remboursement</w:t>
+      </w:r>
+    </w:p>
+    <w:p>
+      <w:pPr>
+        <w:spacing w:after="120"/>
+      </w:pPr>
+      <w:r>
+        <w:rPr>
+          <w:b w:val="0"/>
+          <w:sz w:val="22"/>
+        </w:rPr>
+        <w:t>Un paiement enregistre par un agent ou directeur passe en PENDING_VALIDATION et attend la validation de l'admin. Un paiement direct client ou un webhook CamPay peuvent passer directement en COMPLETED. En cas de probleme, le statut passe en FAILED.</w:t>
+      </w:r>
+    </w:p>
+    <w:p>
+      <w:r>
+        <w:drawing>
+          <wp:inline xmlns:a="http://schemas.openxmlformats.org/drawingml/2006/main" xmlns:pic="http://schemas.openxmlformats.org/drawingml/2006/picture">
+            <wp:extent cx="5669280" cy="3400884"/>
+            <wp:docPr id="20" name="Picture 20"/>
+            <wp:cNvGraphicFramePr>
+              <a:graphicFrameLocks noChangeAspect="1"/>
+            </wp:cNvGraphicFramePr>
+            <a:graphic>
+              <a:graphicData uri="http://schemas.openxmlformats.org/drawingml/2006/picture">
+                <pic:pic>
+                  <pic:nvPicPr>
+                    <pic:cNvPr id="0" name="image.png"/>
+                    <pic:cNvPicPr/>
+                  </pic:nvPicPr>
+                  <pic:blipFill>
+                    <a:blip r:embed="rId28"/>
+                    <a:stretch>
+                      <a:fillRect/>
+                    </a:stretch>
+                  </pic:blipFill>
+                  <pic:spPr>
+                    <a:xfrm>
+                      <a:off x="0" y="0"/>
                       <a:ext cx="5669280" cy="3400884"/>
                     </a:xfrm>
                     <a:prstGeom prst="rect"/>
@@ -3312,7 +3932,7 @@
         <w:drawing>
           <wp:inline xmlns:a="http://schemas.openxmlformats.org/drawingml/2006/main" xmlns:pic="http://schemas.openxmlformats.org/drawingml/2006/picture">
             <wp:extent cx="5669280" cy="3400884"/>
-            <wp:docPr id="12" name="Picture 12"/>
+            <wp:docPr id="21" name="Picture 21"/>
             <wp:cNvGraphicFramePr>
               <a:graphicFrameLocks noChangeAspect="1"/>
             </wp:cNvGraphicFramePr>
@@ -3324,7 +3944,7 @@
                     <pic:cNvPicPr/>
                   </pic:nvPicPr>
                   <pic:blipFill>
-                    <a:blip r:embed="rId20"/>
+                    <a:blip r:embed="rId29"/>
                     <a:stretch>
                       <a:fillRect/>
                     </a:stretch>
@@ -6572,7 +7192,7 @@
         <w:drawing>
           <wp:inline xmlns:a="http://schemas.openxmlformats.org/drawingml/2006/main" xmlns:pic="http://schemas.openxmlformats.org/drawingml/2006/picture">
             <wp:extent cx="5943600" cy="3868057"/>
-            <wp:docPr id="13" name="Picture 13"/>
+            <wp:docPr id="22" name="Picture 22"/>
             <wp:cNvGraphicFramePr>
               <a:graphicFrameLocks noChangeAspect="1"/>
             </wp:cNvGraphicFramePr>
@@ -6584,7 +7204,7 @@
                     <pic:cNvPicPr/>
                   </pic:nvPicPr>
                   <pic:blipFill>
-                    <a:blip r:embed="rId21"/>
+                    <a:blip r:embed="rId30"/>
                     <a:stretch>
                       <a:fillRect/>
                     </a:stretch>

</xml_diff>